<commit_message>
Update vacation ticket template
</commit_message>
<xml_diff>
--- a/PROJECTS_EXCEL/workbook/TravelDocumentsBuilder/Шаблони/Відпустка (Шаблон).docx
+++ b/PROJECTS_EXCEL/workbook/TravelDocumentsBuilder/Шаблони/Відпустка (Шаблон).docx
@@ -1,6 +1,6 @@
 
 <file path=word/document.xml><?xml version="1.0" encoding="utf-8"?>
-<w:document xmlns:wpc="http://schemas.microsoft.com/office/word/2010/wordprocessingCanvas" xmlns:cx="http://schemas.microsoft.com/office/drawing/2014/chartex" xmlns:cx1="http://schemas.microsoft.com/office/drawing/2015/9/8/chartex" xmlns:cx2="http://schemas.microsoft.com/office/drawing/2015/10/21/chartex" xmlns:cx3="http://schemas.microsoft.com/office/drawing/2016/5/9/chartex" xmlns:cx4="http://schemas.microsoft.com/office/drawing/2016/5/10/chartex" xmlns:cx5="http://schemas.microsoft.com/office/drawing/2016/5/11/chartex" xmlns:cx6="http://schemas.microsoft.com/office/drawing/2016/5/12/chartex" xmlns:cx7="http://schemas.microsoft.com/office/drawing/2016/5/13/chartex" xmlns:cx8="http://schemas.microsoft.com/office/drawing/2016/5/14/chartex" xmlns:mc="http://schemas.openxmlformats.org/markup-compatibility/2006" xmlns:aink="http://schemas.microsoft.com/office/drawing/2016/ink" xmlns:am3d="http://schemas.microsoft.com/office/drawing/2017/model3d" xmlns:o="urn:schemas-microsoft-com:office:office" xmlns:oel="http://schemas.microsoft.com/office/2019/extlst" xmlns:r="http://schemas.openxmlformats.org/officeDocument/2006/relationships" xmlns:m="http://schemas.openxmlformats.org/officeDocument/2006/math" xmlns:v="urn:schemas-microsoft-com:vml" xmlns:wp14="http://schemas.microsoft.com/office/word/2010/wordprocessingDrawing" xmlns:wp="http://schemas.openxmlformats.org/drawingml/2006/wordprocessingDrawing" xmlns:w10="urn:schemas-microsoft-com:office:word" xmlns:w="http://schemas.openxmlformats.org/wordprocessingml/2006/main" xmlns:w14="http://schemas.microsoft.com/office/word/2010/wordml" xmlns:w15="http://schemas.microsoft.com/office/word/2012/wordml" xmlns:w16cex="http://schemas.microsoft.com/office/word/2018/wordml/cex" xmlns:w16cid="http://schemas.microsoft.com/office/word/2016/wordml/cid" xmlns:w16="http://schemas.microsoft.com/office/word/2018/wordml" xmlns:w16du="http://schemas.microsoft.com/office/word/2023/wordml/word16du" xmlns:w16sdtdh="http://schemas.microsoft.com/office/word/2020/wordml/sdtdatahash" xmlns:w16sdtfl="http://schemas.microsoft.com/office/word/2024/wordml/sdtformatlock" xmlns:w16se="http://schemas.microsoft.com/office/word/2015/wordml/symex" xmlns:wpg="http://schemas.microsoft.com/office/word/2010/wordprocessingGroup" xmlns:wpi="http://schemas.microsoft.com/office/word/2010/wordprocessingInk" xmlns:wne="http://schemas.microsoft.com/office/word/2006/wordml" xmlns:wps="http://schemas.microsoft.com/office/word/2010/wordprocessingShape" mc:Ignorable="w14 w15 w16se w16cid w16 w16cex w16sdtdh w16sdtfl w16du wp14">
+<w:document xmlns:wpc="http://schemas.microsoft.com/office/word/2010/wordprocessingCanvas" xmlns:cx="http://schemas.microsoft.com/office/drawing/2014/chartex" xmlns:cx1="http://schemas.microsoft.com/office/drawing/2015/9/8/chartex" xmlns:cx2="http://schemas.microsoft.com/office/drawing/2015/10/21/chartex" xmlns:cx3="http://schemas.microsoft.com/office/drawing/2016/5/9/chartex" xmlns:cx4="http://schemas.microsoft.com/office/drawing/2016/5/10/chartex" xmlns:cx5="http://schemas.microsoft.com/office/drawing/2016/5/11/chartex" xmlns:cx6="http://schemas.microsoft.com/office/drawing/2016/5/12/chartex" xmlns:cx7="http://schemas.microsoft.com/office/drawing/2016/5/13/chartex" xmlns:cx8="http://schemas.microsoft.com/office/drawing/2016/5/14/chartex" xmlns:mc="http://schemas.openxmlformats.org/markup-compatibility/2006" xmlns:aink="http://schemas.microsoft.com/office/drawing/2016/ink" xmlns:am3d="http://schemas.microsoft.com/office/drawing/2017/model3d" xmlns:o="urn:schemas-microsoft-com:office:office" xmlns:oel="http://schemas.microsoft.com/office/2019/extlst" xmlns:r="http://schemas.openxmlformats.org/officeDocument/2006/relationships" xmlns:m="http://schemas.openxmlformats.org/officeDocument/2006/math" xmlns:v="urn:schemas-microsoft-com:vml" xmlns:wp14="http://schemas.microsoft.com/office/word/2010/wordprocessingDrawing" xmlns:wp="http://schemas.openxmlformats.org/drawingml/2006/wordprocessingDrawing" xmlns:w10="urn:schemas-microsoft-com:office:word" xmlns:w="http://schemas.openxmlformats.org/wordprocessingml/2006/main" xmlns:w14="http://schemas.microsoft.com/office/word/2010/wordml" xmlns:w15="http://schemas.microsoft.com/office/word/2012/wordml" xmlns:w16cex="http://schemas.microsoft.com/office/word/2018/wordml/cex" xmlns:w16cid="http://schemas.microsoft.com/office/word/2016/wordml/cid" xmlns:w16="http://schemas.microsoft.com/office/word/2018/wordml" xmlns:w16sdtdh="http://schemas.microsoft.com/office/word/2020/wordml/sdtdatahash" xmlns:w16se="http://schemas.microsoft.com/office/word/2015/wordml/symex" xmlns:wpg="http://schemas.microsoft.com/office/word/2010/wordprocessingGroup" xmlns:wpi="http://schemas.microsoft.com/office/word/2010/wordprocessingInk" xmlns:wne="http://schemas.microsoft.com/office/word/2006/wordml" xmlns:wps="http://schemas.microsoft.com/office/word/2010/wordprocessingShape" mc:Ignorable="w14 w15 w16se w16cid w16 w16cex w16sdtdh wp14">
   <w:body>
     <w:tbl>
       <w:tblPr>
@@ -126,7 +126,7 @@
                                                 </pic:cNvPicPr>
                                               </pic:nvPicPr>
                                               <pic:blipFill>
-                                                <a:blip r:embed="rId5">
+                                                <a:blip r:embed="rId7">
                                                   <a:extLst>
                                                     <a:ext uri="{28A0092B-C50C-407E-A947-70E740481C1C}">
                                                       <a14:useLocalDpi xmlns:a14="http://schemas.microsoft.com/office/drawing/2010/main" val="0"/>
@@ -313,7 +313,7 @@
                                           </pic:cNvPicPr>
                                         </pic:nvPicPr>
                                         <pic:blipFill>
-                                          <a:blip r:embed="rId5">
+                                          <a:blip r:embed="rId7">
                                             <a:extLst>
                                               <a:ext uri="{28A0092B-C50C-407E-A947-70E740481C1C}">
                                                 <a14:useLocalDpi xmlns:a14="http://schemas.microsoft.com/office/drawing/2010/main" val="0"/>
@@ -661,21 +661,7 @@
                 <w:sz w:val="28"/>
                 <w:szCs w:val="28"/>
               </w:rPr>
-              <w:t>(</w:t>
-            </w:r>
-            <w:r>
-              <w:rPr>
-                <w:sz w:val="28"/>
-                <w:szCs w:val="28"/>
-              </w:rPr>
-              <w:t>пункт 2.8.9</w:t>
-            </w:r>
-            <w:r>
-              <w:rPr>
-                <w:sz w:val="28"/>
-                <w:szCs w:val="28"/>
-              </w:rPr>
-              <w:t>)</w:t>
+              <w:t>(пункт 2.8.9)</w:t>
             </w:r>
           </w:p>
         </w:tc>
@@ -923,38 +909,23 @@
             <w:r>
               <w:rPr>
                 <w:bCs/>
-              </w:rPr>
-              <w:t>&lt;</w:t>
-            </w:r>
-            <w:proofErr w:type="spellStart"/>
-            <w:r>
-              <w:rPr>
-                <w:bCs/>
                 <w:lang w:val="en-US"/>
               </w:rPr>
+              <w:t>{</w:t>
+            </w:r>
+            <w:r>
+              <w:rPr>
+                <w:bCs/>
+                <w:lang w:val="en-US"/>
+              </w:rPr>
               <w:t>TicketDate</w:t>
             </w:r>
-            <w:proofErr w:type="spellEnd"/>
-            <w:r>
-              <w:rPr>
-                <w:bCs/>
-              </w:rPr>
-              <w:t>&gt;&lt;/</w:t>
-            </w:r>
-            <w:proofErr w:type="spellStart"/>
             <w:r>
               <w:rPr>
                 <w:bCs/>
                 <w:lang w:val="en-US"/>
               </w:rPr>
-              <w:t>TicketDate</w:t>
-            </w:r>
-            <w:proofErr w:type="spellEnd"/>
-            <w:r>
-              <w:rPr>
-                <w:bCs/>
-              </w:rPr>
-              <w:t>&gt;</w:t>
+              <w:t>}</w:t>
             </w:r>
           </w:p>
         </w:tc>
@@ -1039,6 +1010,7 @@
                 <w:caps/>
                 <w:sz w:val="32"/>
                 <w:szCs w:val="28"/>
+                <w:lang w:val="en-US"/>
               </w:rPr>
             </w:pPr>
             <w:r>
@@ -1050,38 +1022,23 @@
             <w:r>
               <w:rPr>
                 <w:bCs/>
-              </w:rPr>
-              <w:t>&lt;</w:t>
-            </w:r>
-            <w:proofErr w:type="spellStart"/>
-            <w:r>
-              <w:rPr>
-                <w:bCs/>
                 <w:lang w:val="en-US"/>
               </w:rPr>
+              <w:t>{</w:t>
+            </w:r>
+            <w:r>
+              <w:rPr>
+                <w:bCs/>
+                <w:lang w:val="en-US"/>
+              </w:rPr>
               <w:t>TicketNum</w:t>
             </w:r>
-            <w:proofErr w:type="spellEnd"/>
-            <w:r>
-              <w:rPr>
-                <w:bCs/>
-              </w:rPr>
-              <w:t>&gt;&lt;/</w:t>
-            </w:r>
-            <w:proofErr w:type="spellStart"/>
             <w:r>
               <w:rPr>
                 <w:bCs/>
                 <w:lang w:val="en-US"/>
               </w:rPr>
-              <w:t>TicketNum</w:t>
-            </w:r>
-            <w:proofErr w:type="spellEnd"/>
-            <w:r>
-              <w:rPr>
-                <w:bCs/>
-              </w:rPr>
-              <w:t>&gt;</w:t>
+              <w:t>}</w:t>
             </w:r>
           </w:p>
         </w:tc>
@@ -1336,9 +1293,8 @@
                 <w:szCs w:val="32"/>
                 <w:lang w:val="en-US"/>
               </w:rPr>
-              <w:t>&lt;</w:t>
-            </w:r>
-            <w:proofErr w:type="spellStart"/>
+              <w:t>{</w:t>
+            </w:r>
             <w:r>
               <w:rPr>
                 <w:sz w:val="32"/>
@@ -1347,32 +1303,13 @@
               </w:rPr>
               <w:t>PersonalLine</w:t>
             </w:r>
-            <w:proofErr w:type="spellEnd"/>
             <w:r>
               <w:rPr>
                 <w:sz w:val="32"/>
                 <w:szCs w:val="32"/>
                 <w:lang w:val="en-US"/>
               </w:rPr>
-              <w:t>&gt;&lt;/</w:t>
-            </w:r>
-            <w:proofErr w:type="spellStart"/>
-            <w:r>
-              <w:rPr>
-                <w:sz w:val="32"/>
-                <w:szCs w:val="32"/>
-                <w:lang w:val="en-US"/>
-              </w:rPr>
-              <w:t>PersonalLine</w:t>
-            </w:r>
-            <w:proofErr w:type="spellEnd"/>
-            <w:r>
-              <w:rPr>
-                <w:sz w:val="32"/>
-                <w:szCs w:val="32"/>
-                <w:lang w:val="en-US"/>
-              </w:rPr>
-              <w:t>&gt;</w:t>
+              <w:t>}</w:t>
             </w:r>
           </w:p>
         </w:tc>
@@ -1472,9 +1409,8 @@
                 <w:szCs w:val="32"/>
                 <w:lang w:val="en-US"/>
               </w:rPr>
-              <w:t>&lt;</w:t>
-            </w:r>
-            <w:proofErr w:type="spellStart"/>
+              <w:t>{</w:t>
+            </w:r>
             <w:r>
               <w:rPr>
                 <w:sz w:val="32"/>
@@ -1483,32 +1419,13 @@
               </w:rPr>
               <w:t>VacationKind</w:t>
             </w:r>
-            <w:proofErr w:type="spellEnd"/>
             <w:r>
               <w:rPr>
                 <w:sz w:val="32"/>
                 <w:szCs w:val="32"/>
                 <w:lang w:val="en-US"/>
               </w:rPr>
-              <w:t>&gt;&lt;/</w:t>
-            </w:r>
-            <w:proofErr w:type="spellStart"/>
-            <w:r>
-              <w:rPr>
-                <w:sz w:val="32"/>
-                <w:szCs w:val="32"/>
-                <w:lang w:val="en-US"/>
-              </w:rPr>
-              <w:t>VacationKind</w:t>
-            </w:r>
-            <w:proofErr w:type="spellEnd"/>
-            <w:r>
-              <w:rPr>
-                <w:sz w:val="32"/>
-                <w:szCs w:val="32"/>
-                <w:lang w:val="en-US"/>
-              </w:rPr>
-              <w:t>&gt;</w:t>
+              <w:t>}</w:t>
             </w:r>
           </w:p>
         </w:tc>
@@ -1579,49 +1496,24 @@
               <w:rPr>
                 <w:sz w:val="32"/>
                 <w:szCs w:val="32"/>
-                <w:lang w:eastAsia="uk-UA"/>
-              </w:rPr>
-            </w:pPr>
-            <w:r>
-              <w:rPr>
-                <w:sz w:val="32"/>
-                <w:szCs w:val="32"/>
-              </w:rPr>
-              <w:t>&lt;</w:t>
-            </w:r>
-            <w:proofErr w:type="spellStart"/>
-            <w:r>
-              <w:rPr>
-                <w:sz w:val="32"/>
-                <w:szCs w:val="32"/>
-              </w:rPr>
-              <w:t>Vacation</w:t>
-            </w:r>
-            <w:proofErr w:type="spellEnd"/>
+                <w:lang w:val="en-US" w:eastAsia="uk-UA"/>
+              </w:rPr>
+            </w:pPr>
             <w:r>
               <w:rPr>
                 <w:sz w:val="32"/>
                 <w:szCs w:val="32"/>
                 <w:lang w:val="en-US"/>
               </w:rPr>
-              <w:t>Place</w:t>
+              <w:t>{</w:t>
             </w:r>
             <w:r>
               <w:rPr>
                 <w:sz w:val="32"/>
                 <w:szCs w:val="32"/>
               </w:rPr>
-              <w:t>&gt;&lt;/</w:t>
-            </w:r>
-            <w:proofErr w:type="spellStart"/>
-            <w:r>
-              <w:rPr>
-                <w:sz w:val="32"/>
-                <w:szCs w:val="32"/>
-              </w:rPr>
               <w:t>Vacation</w:t>
             </w:r>
-            <w:proofErr w:type="spellEnd"/>
             <w:r>
               <w:rPr>
                 <w:sz w:val="32"/>
@@ -1634,8 +1526,9 @@
               <w:rPr>
                 <w:sz w:val="32"/>
                 <w:szCs w:val="32"/>
-              </w:rPr>
-              <w:t>&gt;</w:t>
+                <w:lang w:val="en-US"/>
+              </w:rPr>
+              <w:t>}</w:t>
             </w:r>
           </w:p>
         </w:tc>
@@ -1721,18 +1614,18 @@
                 <w:kern w:val="2"/>
                 <w:sz w:val="32"/>
                 <w:szCs w:val="28"/>
-                <w:lang w:val="ru-RU"/>
-                <w14:ligatures w14:val="standardContextual"/>
-              </w:rPr>
-            </w:pPr>
-            <w:r>
-              <w:rPr>
-                <w:sz w:val="32"/>
-                <w:szCs w:val="28"/>
-              </w:rPr>
-              <w:t>&lt;</w:t>
-            </w:r>
-            <w:proofErr w:type="spellStart"/>
+                <w:lang w:val="en-US"/>
+                <w14:ligatures w14:val="standardContextual"/>
+              </w:rPr>
+            </w:pPr>
+            <w:r>
+              <w:rPr>
+                <w:sz w:val="32"/>
+                <w:szCs w:val="28"/>
+                <w:lang w:val="en-US"/>
+              </w:rPr>
+              <w:t>{</w:t>
+            </w:r>
             <w:r>
               <w:rPr>
                 <w:sz w:val="32"/>
@@ -1740,7 +1633,6 @@
               </w:rPr>
               <w:t>Vacation</w:t>
             </w:r>
-            <w:proofErr w:type="spellEnd"/>
             <w:r>
               <w:rPr>
                 <w:sz w:val="32"/>
@@ -1753,32 +1645,9 @@
               <w:rPr>
                 <w:sz w:val="32"/>
                 <w:szCs w:val="28"/>
-              </w:rPr>
-              <w:t>&gt;&lt;/</w:t>
-            </w:r>
-            <w:proofErr w:type="spellStart"/>
-            <w:r>
-              <w:rPr>
-                <w:sz w:val="32"/>
-                <w:szCs w:val="28"/>
-              </w:rPr>
-              <w:t>Vacation</w:t>
-            </w:r>
-            <w:proofErr w:type="spellEnd"/>
-            <w:r>
-              <w:rPr>
-                <w:sz w:val="32"/>
-                <w:szCs w:val="28"/>
                 <w:lang w:val="en-US"/>
               </w:rPr>
-              <w:t>Duration</w:t>
-            </w:r>
-            <w:r>
-              <w:rPr>
-                <w:sz w:val="32"/>
-                <w:szCs w:val="28"/>
-              </w:rPr>
-              <w:t>&gt;</w:t>
+              <w:t>}</w:t>
             </w:r>
           </w:p>
         </w:tc>
@@ -1885,9 +1754,8 @@
                 <w:szCs w:val="32"/>
                 <w:lang w:val="en-US"/>
               </w:rPr>
-              <w:t>&lt;</w:t>
-            </w:r>
-            <w:proofErr w:type="spellStart"/>
+              <w:t>{</w:t>
+            </w:r>
             <w:r>
               <w:rPr>
                 <w:sz w:val="32"/>
@@ -1896,54 +1764,44 @@
               </w:rPr>
               <w:t>DateFrom</w:t>
             </w:r>
-            <w:proofErr w:type="spellEnd"/>
             <w:r>
               <w:rPr>
                 <w:sz w:val="32"/>
                 <w:szCs w:val="32"/>
                 <w:lang w:val="en-US"/>
               </w:rPr>
-              <w:t>&gt;&lt;/</w:t>
-            </w:r>
-            <w:proofErr w:type="spellStart"/>
+              <w:t xml:space="preserve">} </w:t>
+            </w:r>
+            <w:r>
+              <w:rPr>
+                <w:sz w:val="32"/>
+                <w:szCs w:val="32"/>
+                <w:lang w:val="ru-RU"/>
+              </w:rPr>
+              <w:t>по</w:t>
+            </w:r>
+            <w:r>
+              <w:rPr>
+                <w:sz w:val="32"/>
+                <w:szCs w:val="32"/>
+              </w:rPr>
+              <w:t xml:space="preserve"> </w:t>
+            </w:r>
             <w:r>
               <w:rPr>
                 <w:sz w:val="32"/>
                 <w:szCs w:val="32"/>
                 <w:lang w:val="en-US"/>
               </w:rPr>
-              <w:t>DateFrom</w:t>
-            </w:r>
-            <w:proofErr w:type="spellEnd"/>
+              <w:t>{</w:t>
+            </w:r>
             <w:r>
               <w:rPr>
                 <w:sz w:val="32"/>
                 <w:szCs w:val="32"/>
                 <w:lang w:val="en-US"/>
               </w:rPr>
-              <w:t>&gt;</w:t>
-            </w:r>
-            <w:r>
-              <w:rPr>
-                <w:sz w:val="32"/>
-                <w:szCs w:val="32"/>
-              </w:rPr>
-              <w:t xml:space="preserve"> </w:t>
-            </w:r>
-            <w:r>
-              <w:rPr>
-                <w:sz w:val="32"/>
-                <w:szCs w:val="32"/>
-                <w:lang w:val="ru-RU"/>
-              </w:rPr>
-              <w:t>по</w:t>
-            </w:r>
-            <w:r>
-              <w:rPr>
-                <w:sz w:val="32"/>
-                <w:szCs w:val="32"/>
-              </w:rPr>
-              <w:t xml:space="preserve"> </w:t>
+              <w:t>DateTo</w:t>
             </w:r>
             <w:r>
               <w:rPr>
@@ -1951,43 +1809,7 @@
                 <w:szCs w:val="32"/>
                 <w:lang w:val="en-US"/>
               </w:rPr>
-              <w:t>&lt;</w:t>
-            </w:r>
-            <w:proofErr w:type="spellStart"/>
-            <w:r>
-              <w:rPr>
-                <w:sz w:val="32"/>
-                <w:szCs w:val="32"/>
-                <w:lang w:val="en-US"/>
-              </w:rPr>
-              <w:t>DateTo</w:t>
-            </w:r>
-            <w:proofErr w:type="spellEnd"/>
-            <w:r>
-              <w:rPr>
-                <w:sz w:val="32"/>
-                <w:szCs w:val="32"/>
-                <w:lang w:val="en-US"/>
-              </w:rPr>
-              <w:t>&gt;&lt;/</w:t>
-            </w:r>
-            <w:proofErr w:type="spellStart"/>
-            <w:r>
-              <w:rPr>
-                <w:sz w:val="32"/>
-                <w:szCs w:val="32"/>
-                <w:lang w:val="en-US"/>
-              </w:rPr>
-              <w:t>DateTo</w:t>
-            </w:r>
-            <w:proofErr w:type="spellEnd"/>
-            <w:r>
-              <w:rPr>
-                <w:sz w:val="32"/>
-                <w:szCs w:val="32"/>
-                <w:lang w:val="en-US"/>
-              </w:rPr>
-              <w:t>&gt;</w:t>
+              <w:t>}</w:t>
             </w:r>
           </w:p>
         </w:tc>
@@ -2081,11 +1903,11 @@
                 <w:kern w:val="2"/>
                 <w:sz w:val="32"/>
                 <w:szCs w:val="28"/>
-                <w14:ligatures w14:val="standardContextual"/>
-              </w:rPr>
-              <w:t>&lt;</w:t>
-            </w:r>
-            <w:proofErr w:type="spellStart"/>
+                <w:lang w:val="en-US"/>
+                <w14:ligatures w14:val="standardContextual"/>
+              </w:rPr>
+              <w:t>{</w:t>
+            </w:r>
             <w:r>
               <w:rPr>
                 <w:bCs/>
@@ -2109,7 +1931,6 @@
               </w:rPr>
               <w:t>rsonalInitials</w:t>
             </w:r>
-            <w:proofErr w:type="spellEnd"/>
             <w:r>
               <w:rPr>
                 <w:bCs/>
@@ -2117,45 +1938,10 @@
                 <w:kern w:val="2"/>
                 <w:sz w:val="32"/>
                 <w:szCs w:val="28"/>
-                <w14:ligatures w14:val="standardContextual"/>
-              </w:rPr>
-              <w:t>&gt;&lt;/</w:t>
-            </w:r>
-            <w:proofErr w:type="spellStart"/>
-            <w:r>
-              <w:rPr>
-                <w:bCs/>
-                <w:iCs/>
-                <w:kern w:val="2"/>
-                <w:sz w:val="32"/>
-                <w:szCs w:val="28"/>
-                <w14:ligatures w14:val="standardContextual"/>
-              </w:rPr>
-              <w:t>Personal</w:t>
-            </w:r>
-            <w:proofErr w:type="spellEnd"/>
-            <w:r>
-              <w:rPr>
-                <w:bCs/>
-                <w:iCs/>
-                <w:kern w:val="2"/>
-                <w:sz w:val="32"/>
-                <w:szCs w:val="28"/>
                 <w:lang w:val="en-US"/>
                 <w14:ligatures w14:val="standardContextual"/>
               </w:rPr>
-              <w:t>Initials</w:t>
-            </w:r>
-            <w:r>
-              <w:rPr>
-                <w:bCs/>
-                <w:iCs/>
-                <w:kern w:val="2"/>
-                <w:sz w:val="32"/>
-                <w:szCs w:val="28"/>
-                <w14:ligatures w14:val="standardContextual"/>
-              </w:rPr>
-              <w:t>&gt;</w:t>
+              <w:t>}</w:t>
             </w:r>
           </w:p>
         </w:tc>
@@ -2410,9 +2196,8 @@
                 <w:u w:val="single"/>
                 <w:lang w:val="en-US"/>
               </w:rPr>
-              <w:t>&lt;</w:t>
-            </w:r>
-            <w:proofErr w:type="spellStart"/>
+              <w:t>{</w:t>
+            </w:r>
             <w:r>
               <w:rPr>
                 <w:sz w:val="32"/>
@@ -2422,7 +2207,6 @@
               </w:rPr>
               <w:t>DateArrival</w:t>
             </w:r>
-            <w:proofErr w:type="spellEnd"/>
             <w:r>
               <w:rPr>
                 <w:sz w:val="32"/>
@@ -2430,27 +2214,7 @@
                 <w:u w:val="single"/>
                 <w:lang w:val="en-US"/>
               </w:rPr>
-              <w:t>&gt;&lt;/</w:t>
-            </w:r>
-            <w:proofErr w:type="spellStart"/>
-            <w:r>
-              <w:rPr>
-                <w:sz w:val="32"/>
-                <w:szCs w:val="32"/>
-                <w:u w:val="single"/>
-                <w:lang w:val="en-US"/>
-              </w:rPr>
-              <w:t>DateArrival</w:t>
-            </w:r>
-            <w:proofErr w:type="spellEnd"/>
-            <w:r>
-              <w:rPr>
-                <w:sz w:val="32"/>
-                <w:szCs w:val="32"/>
-                <w:u w:val="single"/>
-                <w:lang w:val="en-US"/>
-              </w:rPr>
-              <w:t>&gt;</w:t>
+              <w:t>}</w:t>
             </w:r>
             <w:r>
               <w:rPr>
@@ -2628,9 +2392,8 @@
           <w:szCs w:val="32"/>
           <w:lang w:val="en-US"/>
         </w:rPr>
-        <w:t>&lt;</w:t>
+        <w:t>{</w:t>
       </w:r>
-      <w:proofErr w:type="spellStart"/>
       <w:r>
         <w:rPr>
           <w:bCs/>
@@ -2649,7 +2412,6 @@
         </w:rPr>
         <w:t>Text</w:t>
       </w:r>
-      <w:proofErr w:type="spellEnd"/>
       <w:r>
         <w:rPr>
           <w:bCs/>
@@ -2657,198 +2419,12 @@
           <w:szCs w:val="32"/>
           <w:lang w:val="en-US"/>
         </w:rPr>
-        <w:t>&gt;</w:t>
-      </w:r>
-      <w:r>
-        <w:rPr>
-          <w:bCs/>
-          <w:sz w:val="32"/>
-          <w:szCs w:val="32"/>
-          <w:lang w:val="en-US"/>
-        </w:rPr>
-        <w:t>&lt;</w:t>
-      </w:r>
-      <w:r>
-        <w:rPr>
-          <w:bCs/>
-          <w:sz w:val="32"/>
-          <w:szCs w:val="32"/>
-          <w:lang w:val="en-US"/>
-        </w:rPr>
-        <w:t>/</w:t>
-      </w:r>
-      <w:proofErr w:type="spellStart"/>
-      <w:r>
-        <w:rPr>
-          <w:bCs/>
-          <w:sz w:val="32"/>
-          <w:szCs w:val="32"/>
-          <w:lang w:val="en-US"/>
-        </w:rPr>
-        <w:t>VacationAbroad</w:t>
-      </w:r>
-      <w:r>
-        <w:rPr>
-          <w:bCs/>
-          <w:sz w:val="32"/>
-          <w:szCs w:val="32"/>
-          <w:lang w:val="en-US"/>
-        </w:rPr>
-        <w:t>Text</w:t>
-      </w:r>
-      <w:proofErr w:type="spellEnd"/>
-      <w:r>
-        <w:rPr>
-          <w:bCs/>
-          <w:sz w:val="32"/>
-          <w:szCs w:val="32"/>
-          <w:lang w:val="en-US"/>
-        </w:rPr>
-        <w:t>&gt;</w:t>
+        <w:t>}</w:t>
       </w:r>
     </w:p>
     <w:p>
       <w:pPr>
-        <w:rPr>
-          <w:bCs/>
-          <w:sz w:val="32"/>
-          <w:szCs w:val="32"/>
-        </w:rPr>
-      </w:pPr>
-      <w:r>
-        <w:rPr>
-          <w:bCs/>
-          <w:sz w:val="32"/>
-          <w:szCs w:val="32"/>
-          <w:lang w:val="en-US"/>
-        </w:rPr>
-        <w:t>&lt;</w:t>
-      </w:r>
-      <w:proofErr w:type="spellStart"/>
-      <w:r>
-        <w:rPr>
-          <w:bCs/>
-          <w:sz w:val="32"/>
-          <w:szCs w:val="32"/>
-          <w:lang w:val="en-US"/>
-        </w:rPr>
-        <w:t>FooterSpacer</w:t>
-      </w:r>
-      <w:proofErr w:type="spellEnd"/>
-      <w:r>
-        <w:rPr>
-          <w:bCs/>
-          <w:sz w:val="32"/>
-          <w:szCs w:val="32"/>
-          <w:lang w:val="en-US"/>
-        </w:rPr>
-        <w:t>&gt;&lt;/</w:t>
-      </w:r>
-      <w:proofErr w:type="spellStart"/>
-      <w:r>
-        <w:rPr>
-          <w:bCs/>
-          <w:sz w:val="32"/>
-          <w:szCs w:val="32"/>
-          <w:lang w:val="en-US"/>
-        </w:rPr>
-        <w:t>FooterSpacer</w:t>
-      </w:r>
-      <w:proofErr w:type="spellEnd"/>
-      <w:r>
-        <w:rPr>
-          <w:bCs/>
-          <w:sz w:val="32"/>
-          <w:szCs w:val="32"/>
-          <w:lang w:val="en-US"/>
-        </w:rPr>
-        <w:t>&gt;</w:t>
-      </w:r>
-    </w:p>
-    <w:p>
-      <w:pPr>
-        <w:autoSpaceDE w:val="0"/>
-        <w:autoSpaceDN w:val="0"/>
-        <w:jc w:val="both"/>
-        <w:rPr>
-          <w:bCs/>
-          <w:sz w:val="36"/>
-          <w:szCs w:val="28"/>
-        </w:rPr>
-      </w:pPr>
-      <w:r>
-        <w:rPr>
-          <w:bCs/>
-          <w:sz w:val="36"/>
-          <w:szCs w:val="28"/>
-        </w:rPr>
-        <w:t>Командир військової частини А7383</w:t>
-      </w:r>
-    </w:p>
-    <w:p>
-      <w:pPr>
-        <w:autoSpaceDE w:val="0"/>
-        <w:autoSpaceDN w:val="0"/>
-        <w:jc w:val="both"/>
-        <w:rPr>
-          <w:bCs/>
-          <w:sz w:val="36"/>
-          <w:szCs w:val="28"/>
-          <w:u w:val="single"/>
-        </w:rPr>
-      </w:pPr>
-      <w:r>
-        <w:rPr>
-          <w:bCs/>
-          <w:sz w:val="36"/>
-          <w:szCs w:val="28"/>
-          <w:u w:val="single"/>
-        </w:rPr>
-        <w:t xml:space="preserve">підполковник       </w:t>
-      </w:r>
-      <w:r>
-        <w:rPr>
-          <w:bCs/>
-          <w:sz w:val="36"/>
-          <w:szCs w:val="28"/>
-          <w:u w:val="single"/>
-        </w:rPr>
-        <w:tab/>
-      </w:r>
-      <w:r>
-        <w:rPr>
-          <w:bCs/>
-          <w:sz w:val="36"/>
-          <w:szCs w:val="28"/>
-          <w:u w:val="single"/>
-        </w:rPr>
-        <w:tab/>
-        <w:t xml:space="preserve">                                 Олег ЧЕРКАШИН</w:t>
-      </w:r>
-    </w:p>
-    <w:p>
-      <w:pPr>
-        <w:autoSpaceDE w:val="0"/>
-        <w:autoSpaceDN w:val="0"/>
-        <w:jc w:val="center"/>
-        <w:rPr>
-          <w:bCs/>
-          <w:szCs w:val="28"/>
-        </w:rPr>
-      </w:pPr>
-      <w:r>
-        <w:rPr>
-          <w:bCs/>
-          <w:szCs w:val="28"/>
-        </w:rPr>
-        <w:t xml:space="preserve"> (військове звання, підпис, ініціали (ініціал імені) та прізвище)</w:t>
-      </w:r>
-    </w:p>
-    <w:p>
-      <w:pPr>
-        <w:autoSpaceDE w:val="0"/>
-        <w:autoSpaceDN w:val="0"/>
-        <w:jc w:val="both"/>
+        <w:spacing w:after="160" w:line="259" w:lineRule="auto"/>
         <w:rPr>
           <w:bCs/>
           <w:sz w:val="28"/>
@@ -2861,38 +2437,8 @@
           <w:sz w:val="28"/>
           <w:szCs w:val="28"/>
         </w:rPr>
-        <w:t>М.П</w:t>
+        <w:br w:type="page"/>
       </w:r>
-    </w:p>
-    <w:p>
-      <w:pPr>
-        <w:ind w:left="360"/>
-        <w:jc w:val="right"/>
-        <w:rPr>
-          <w:bCs/>
-          <w:lang w:val="ru-RU"/>
-        </w:rPr>
-      </w:pPr>
-    </w:p>
-    <w:p>
-      <w:pPr>
-        <w:ind w:left="360"/>
-        <w:jc w:val="right"/>
-        <w:rPr>
-          <w:bCs/>
-          <w:lang w:val="ru-RU"/>
-        </w:rPr>
-      </w:pPr>
-    </w:p>
-    <w:p>
-      <w:pPr>
-        <w:ind w:left="360"/>
-        <w:jc w:val="right"/>
-        <w:rPr>
-          <w:bCs/>
-          <w:lang w:val="ru-RU"/>
-        </w:rPr>
-      </w:pPr>
     </w:p>
     <w:p>
       <w:pPr>
@@ -2910,6 +2456,7 @@
           <w:sz w:val="28"/>
           <w:szCs w:val="28"/>
         </w:rPr>
+        <w:lastRenderedPageBreak/>
         <w:t>Продовження додатка 3</w:t>
       </w:r>
       <w:r>
@@ -3552,35 +3099,381 @@
       </w:tr>
     </w:tbl>
     <w:p/>
-    <w:p/>
-    <w:p/>
-    <w:p/>
-    <w:p/>
-    <w:p/>
-    <w:p/>
-    <w:p/>
-    <w:p/>
-    <w:p/>
-    <w:p/>
-    <w:p/>
-    <w:p/>
-    <w:p/>
-    <w:p/>
-    <w:p/>
-    <w:p/>
-    <w:p/>
     <w:sectPr>
+      <w:footerReference w:type="first" r:id="rId8"/>
       <w:pgSz w:w="11906" w:h="16838"/>
-      <w:pgMar w:top="284" w:right="850" w:bottom="426" w:left="1417" w:header="708" w:footer="708" w:gutter="0"/>
+      <w:pgMar w:top="284" w:right="850" w:bottom="426" w:left="1417" w:header="708" w:footer="234" w:gutter="0"/>
       <w:cols w:space="708"/>
+      <w:titlePg/>
       <w:docGrid w:linePitch="360"/>
     </w:sectPr>
   </w:body>
 </w:document>
 </file>
 
+<file path=word/endnotes.xml><?xml version="1.0" encoding="utf-8"?>
+<w:endnotes xmlns:wpc="http://schemas.microsoft.com/office/word/2010/wordprocessingCanvas" xmlns:cx="http://schemas.microsoft.com/office/drawing/2014/chartex" xmlns:cx1="http://schemas.microsoft.com/office/drawing/2015/9/8/chartex" xmlns:cx2="http://schemas.microsoft.com/office/drawing/2015/10/21/chartex" xmlns:cx3="http://schemas.microsoft.com/office/drawing/2016/5/9/chartex" xmlns:cx4="http://schemas.microsoft.com/office/drawing/2016/5/10/chartex" xmlns:cx5="http://schemas.microsoft.com/office/drawing/2016/5/11/chartex" xmlns:cx6="http://schemas.microsoft.com/office/drawing/2016/5/12/chartex" xmlns:cx7="http://schemas.microsoft.com/office/drawing/2016/5/13/chartex" xmlns:cx8="http://schemas.microsoft.com/office/drawing/2016/5/14/chartex" xmlns:mc="http://schemas.openxmlformats.org/markup-compatibility/2006" xmlns:aink="http://schemas.microsoft.com/office/drawing/2016/ink" xmlns:am3d="http://schemas.microsoft.com/office/drawing/2017/model3d" xmlns:o="urn:schemas-microsoft-com:office:office" xmlns:oel="http://schemas.microsoft.com/office/2019/extlst" xmlns:r="http://schemas.openxmlformats.org/officeDocument/2006/relationships" xmlns:m="http://schemas.openxmlformats.org/officeDocument/2006/math" xmlns:v="urn:schemas-microsoft-com:vml" xmlns:wp14="http://schemas.microsoft.com/office/word/2010/wordprocessingDrawing" xmlns:wp="http://schemas.openxmlformats.org/drawingml/2006/wordprocessingDrawing" xmlns:w10="urn:schemas-microsoft-com:office:word" xmlns:w="http://schemas.openxmlformats.org/wordprocessingml/2006/main" xmlns:w14="http://schemas.microsoft.com/office/word/2010/wordml" xmlns:w15="http://schemas.microsoft.com/office/word/2012/wordml" xmlns:w16cex="http://schemas.microsoft.com/office/word/2018/wordml/cex" xmlns:w16cid="http://schemas.microsoft.com/office/word/2016/wordml/cid" xmlns:w16="http://schemas.microsoft.com/office/word/2018/wordml" xmlns:w16sdtdh="http://schemas.microsoft.com/office/word/2020/wordml/sdtdatahash" xmlns:w16se="http://schemas.microsoft.com/office/word/2015/wordml/symex" xmlns:wpg="http://schemas.microsoft.com/office/word/2010/wordprocessingGroup" xmlns:wpi="http://schemas.microsoft.com/office/word/2010/wordprocessingInk" xmlns:wne="http://schemas.microsoft.com/office/word/2006/wordml" xmlns:wps="http://schemas.microsoft.com/office/word/2010/wordprocessingShape" mc:Ignorable="w14 w15 w16se w16cid w16 w16cex w16sdtdh wp14">
+  <w:endnote w:type="separator" w:id="-1">
+    <w:p>
+      <w:r>
+        <w:separator/>
+      </w:r>
+    </w:p>
+  </w:endnote>
+  <w:endnote w:type="continuationSeparator" w:id="0">
+    <w:p>
+      <w:r>
+        <w:continuationSeparator/>
+      </w:r>
+    </w:p>
+  </w:endnote>
+</w:endnotes>
+</file>
+
+<file path=word/footer1.xml><?xml version="1.0" encoding="utf-8"?>
+<w:ftr xmlns:wpc="http://schemas.microsoft.com/office/word/2010/wordprocessingCanvas" xmlns:cx="http://schemas.microsoft.com/office/drawing/2014/chartex" xmlns:cx1="http://schemas.microsoft.com/office/drawing/2015/9/8/chartex" xmlns:cx2="http://schemas.microsoft.com/office/drawing/2015/10/21/chartex" xmlns:cx3="http://schemas.microsoft.com/office/drawing/2016/5/9/chartex" xmlns:cx4="http://schemas.microsoft.com/office/drawing/2016/5/10/chartex" xmlns:cx5="http://schemas.microsoft.com/office/drawing/2016/5/11/chartex" xmlns:cx6="http://schemas.microsoft.com/office/drawing/2016/5/12/chartex" xmlns:cx7="http://schemas.microsoft.com/office/drawing/2016/5/13/chartex" xmlns:cx8="http://schemas.microsoft.com/office/drawing/2016/5/14/chartex" xmlns:mc="http://schemas.openxmlformats.org/markup-compatibility/2006" xmlns:aink="http://schemas.microsoft.com/office/drawing/2016/ink" xmlns:am3d="http://schemas.microsoft.com/office/drawing/2017/model3d" xmlns:o="urn:schemas-microsoft-com:office:office" xmlns:oel="http://schemas.microsoft.com/office/2019/extlst" xmlns:r="http://schemas.openxmlformats.org/officeDocument/2006/relationships" xmlns:m="http://schemas.openxmlformats.org/officeDocument/2006/math" xmlns:v="urn:schemas-microsoft-com:vml" xmlns:wp14="http://schemas.microsoft.com/office/word/2010/wordprocessingDrawing" xmlns:wp="http://schemas.openxmlformats.org/drawingml/2006/wordprocessingDrawing" xmlns:w10="urn:schemas-microsoft-com:office:word" xmlns:w="http://schemas.openxmlformats.org/wordprocessingml/2006/main" xmlns:w14="http://schemas.microsoft.com/office/word/2010/wordml" xmlns:w15="http://schemas.microsoft.com/office/word/2012/wordml" xmlns:w16cex="http://schemas.microsoft.com/office/word/2018/wordml/cex" xmlns:w16cid="http://schemas.microsoft.com/office/word/2016/wordml/cid" xmlns:w16="http://schemas.microsoft.com/office/word/2018/wordml" xmlns:w16sdtdh="http://schemas.microsoft.com/office/word/2020/wordml/sdtdatahash" xmlns:w16se="http://schemas.microsoft.com/office/word/2015/wordml/symex" xmlns:wpg="http://schemas.microsoft.com/office/word/2010/wordprocessingGroup" xmlns:wpi="http://schemas.microsoft.com/office/word/2010/wordprocessingInk" xmlns:wne="http://schemas.microsoft.com/office/word/2006/wordml" xmlns:wps="http://schemas.microsoft.com/office/word/2010/wordprocessingShape" mc:Ignorable="w14 w15 w16se w16cid w16 w16cex w16sdtdh wp14">
+  <w:tbl>
+    <w:tblPr>
+      <w:tblStyle w:val="TableGrid"/>
+      <w:tblW w:w="0" w:type="auto"/>
+      <w:tblBorders>
+        <w:top w:val="none" w:sz="0" w:space="0" w:color="auto"/>
+        <w:left w:val="none" w:sz="0" w:space="0" w:color="auto"/>
+        <w:bottom w:val="none" w:sz="0" w:space="0" w:color="auto"/>
+        <w:right w:val="none" w:sz="0" w:space="0" w:color="auto"/>
+        <w:insideH w:val="none" w:sz="0" w:space="0" w:color="auto"/>
+        <w:insideV w:val="none" w:sz="0" w:space="0" w:color="auto"/>
+      </w:tblBorders>
+      <w:tblLayout w:type="fixed"/>
+      <w:tblCellMar>
+        <w:left w:w="0" w:type="dxa"/>
+        <w:right w:w="0" w:type="dxa"/>
+      </w:tblCellMar>
+      <w:tblLook w:val="04A0" w:firstRow="1" w:lastRow="0" w:firstColumn="1" w:lastColumn="0" w:noHBand="0" w:noVBand="1"/>
+    </w:tblPr>
+    <w:tblGrid>
+      <w:gridCol w:w="2689"/>
+      <w:gridCol w:w="2551"/>
+      <w:gridCol w:w="572"/>
+      <w:gridCol w:w="3119"/>
+    </w:tblGrid>
+    <w:tr>
+      <w:tc>
+        <w:tcPr>
+          <w:tcW w:w="5812" w:type="dxa"/>
+          <w:gridSpan w:val="3"/>
+        </w:tcPr>
+        <w:p>
+          <w:pPr>
+            <w:jc w:val="both"/>
+            <w:rPr>
+              <w:color w:val="000000"/>
+              <w:sz w:val="28"/>
+              <w:szCs w:val="28"/>
+            </w:rPr>
+          </w:pPr>
+          <w:bookmarkStart w:id="0" w:name="_Hlk242446167"/>
+          <w:r>
+            <w:rPr>
+              <w:sz w:val="28"/>
+              <w:szCs w:val="28"/>
+            </w:rPr>
+            <w:t>{Signatory</w:t>
+          </w:r>
+          <w:r>
+            <w:rPr>
+              <w:sz w:val="28"/>
+              <w:szCs w:val="28"/>
+              <w:lang w:val="en-US"/>
+            </w:rPr>
+            <w:t>Position</w:t>
+          </w:r>
+          <w:r>
+            <w:rPr>
+              <w:sz w:val="28"/>
+              <w:szCs w:val="28"/>
+            </w:rPr>
+            <w:t>}</w:t>
+          </w:r>
+        </w:p>
+      </w:tc>
+      <w:tc>
+        <w:tcPr>
+          <w:tcW w:w="3119" w:type="dxa"/>
+          <w:vAlign w:val="center"/>
+        </w:tcPr>
+        <w:p>
+          <w:pPr>
+            <w:jc w:val="right"/>
+            <w:rPr>
+              <w:sz w:val="28"/>
+              <w:szCs w:val="28"/>
+            </w:rPr>
+          </w:pPr>
+        </w:p>
+      </w:tc>
+    </w:tr>
+    <w:tr>
+      <w:tc>
+        <w:tcPr>
+          <w:tcW w:w="2689" w:type="dxa"/>
+          <w:tcBorders>
+            <w:bottom w:val="single" w:sz="4" w:space="0" w:color="auto"/>
+          </w:tcBorders>
+        </w:tcPr>
+        <w:p>
+          <w:pPr>
+            <w:jc w:val="both"/>
+            <w:rPr>
+              <w:sz w:val="28"/>
+              <w:szCs w:val="28"/>
+              <w:lang w:val="en-US"/>
+            </w:rPr>
+          </w:pPr>
+          <w:r>
+            <w:rPr>
+              <w:sz w:val="28"/>
+              <w:szCs w:val="28"/>
+            </w:rPr>
+            <w:t>{Signatory</w:t>
+          </w:r>
+          <w:r>
+            <w:rPr>
+              <w:sz w:val="28"/>
+              <w:szCs w:val="28"/>
+              <w:lang w:val="en-US"/>
+            </w:rPr>
+            <w:t>Rank</w:t>
+          </w:r>
+          <w:r>
+            <w:rPr>
+              <w:sz w:val="28"/>
+              <w:szCs w:val="28"/>
+            </w:rPr>
+            <w:t>}</w:t>
+          </w:r>
+        </w:p>
+      </w:tc>
+      <w:tc>
+        <w:tcPr>
+          <w:tcW w:w="2551" w:type="dxa"/>
+          <w:tcBorders>
+            <w:bottom w:val="single" w:sz="4" w:space="0" w:color="auto"/>
+          </w:tcBorders>
+        </w:tcPr>
+        <w:p>
+          <w:pPr>
+            <w:jc w:val="both"/>
+            <w:rPr>
+              <w:sz w:val="28"/>
+              <w:szCs w:val="28"/>
+              <w:lang w:val="en-US"/>
+            </w:rPr>
+          </w:pPr>
+        </w:p>
+      </w:tc>
+      <w:tc>
+        <w:tcPr>
+          <w:tcW w:w="572" w:type="dxa"/>
+          <w:tcBorders>
+            <w:bottom w:val="single" w:sz="4" w:space="0" w:color="auto"/>
+          </w:tcBorders>
+        </w:tcPr>
+        <w:p>
+          <w:pPr>
+            <w:jc w:val="both"/>
+            <w:rPr>
+              <w:sz w:val="28"/>
+              <w:szCs w:val="28"/>
+              <w:lang w:val="en-US"/>
+            </w:rPr>
+          </w:pPr>
+        </w:p>
+      </w:tc>
+      <w:tc>
+        <w:tcPr>
+          <w:tcW w:w="3119" w:type="dxa"/>
+          <w:tcBorders>
+            <w:bottom w:val="single" w:sz="4" w:space="0" w:color="auto"/>
+          </w:tcBorders>
+          <w:vAlign w:val="center"/>
+        </w:tcPr>
+        <w:p>
+          <w:pPr>
+            <w:jc w:val="right"/>
+            <w:rPr>
+              <w:sz w:val="28"/>
+              <w:szCs w:val="28"/>
+              <w:lang w:val="en-US"/>
+            </w:rPr>
+          </w:pPr>
+          <w:r>
+            <w:rPr>
+              <w:sz w:val="28"/>
+              <w:szCs w:val="28"/>
+            </w:rPr>
+            <w:t>{Signatory</w:t>
+          </w:r>
+          <w:r>
+            <w:rPr>
+              <w:sz w:val="28"/>
+              <w:szCs w:val="28"/>
+            </w:rPr>
+            <w:t>Name</w:t>
+          </w:r>
+          <w:r>
+            <w:rPr>
+              <w:sz w:val="28"/>
+              <w:szCs w:val="28"/>
+            </w:rPr>
+            <w:t>}</w:t>
+          </w:r>
+        </w:p>
+      </w:tc>
+    </w:tr>
+    <w:tr>
+      <w:tc>
+        <w:tcPr>
+          <w:tcW w:w="8931" w:type="dxa"/>
+          <w:gridSpan w:val="4"/>
+          <w:tcBorders>
+            <w:top w:val="single" w:sz="4" w:space="0" w:color="auto"/>
+          </w:tcBorders>
+          <w:vAlign w:val="center"/>
+        </w:tcPr>
+        <w:p>
+          <w:pPr>
+            <w:jc w:val="center"/>
+            <w:rPr>
+              <w:sz w:val="28"/>
+              <w:szCs w:val="28"/>
+              <w:lang w:val="uk-UA"/>
+            </w:rPr>
+          </w:pPr>
+          <w:r>
+            <w:rPr>
+              <w:bCs/>
+              <w:szCs w:val="28"/>
+              <w:lang w:val="uk-UA"/>
+            </w:rPr>
+            <w:t>(військове звання, підпис, ініціали (ініціал імені) та прізвище)</w:t>
+          </w:r>
+        </w:p>
+      </w:tc>
+    </w:tr>
+    <w:tr>
+      <w:tc>
+        <w:tcPr>
+          <w:tcW w:w="2689" w:type="dxa"/>
+          <w:vAlign w:val="center"/>
+        </w:tcPr>
+        <w:p>
+          <w:pPr>
+            <w:autoSpaceDE w:val="0"/>
+            <w:autoSpaceDN w:val="0"/>
+            <w:jc w:val="both"/>
+            <w:rPr>
+              <w:bCs/>
+              <w:sz w:val="28"/>
+              <w:szCs w:val="28"/>
+            </w:rPr>
+          </w:pPr>
+          <w:r>
+            <w:rPr>
+              <w:bCs/>
+              <w:sz w:val="28"/>
+              <w:szCs w:val="28"/>
+            </w:rPr>
+            <w:t>М.П</w:t>
+          </w:r>
+        </w:p>
+      </w:tc>
+      <w:tc>
+        <w:tcPr>
+          <w:tcW w:w="2551" w:type="dxa"/>
+        </w:tcPr>
+        <w:p>
+          <w:pPr>
+            <w:jc w:val="both"/>
+            <w:rPr>
+              <w:sz w:val="28"/>
+              <w:szCs w:val="28"/>
+              <w:lang w:val="en-US"/>
+            </w:rPr>
+          </w:pPr>
+        </w:p>
+      </w:tc>
+      <w:tc>
+        <w:tcPr>
+          <w:tcW w:w="572" w:type="dxa"/>
+        </w:tcPr>
+        <w:p>
+          <w:pPr>
+            <w:jc w:val="both"/>
+            <w:rPr>
+              <w:sz w:val="28"/>
+              <w:szCs w:val="28"/>
+              <w:lang w:val="en-US"/>
+            </w:rPr>
+          </w:pPr>
+        </w:p>
+      </w:tc>
+      <w:tc>
+        <w:tcPr>
+          <w:tcW w:w="3119" w:type="dxa"/>
+          <w:vAlign w:val="center"/>
+        </w:tcPr>
+        <w:p>
+          <w:pPr>
+            <w:jc w:val="right"/>
+            <w:rPr>
+              <w:sz w:val="28"/>
+              <w:szCs w:val="28"/>
+              <w:lang w:val="en-US"/>
+            </w:rPr>
+          </w:pPr>
+        </w:p>
+      </w:tc>
+    </w:tr>
+    <w:bookmarkEnd w:id="0"/>
+  </w:tbl>
+  <w:p>
+    <w:pPr>
+      <w:autoSpaceDE w:val="0"/>
+      <w:autoSpaceDN w:val="0"/>
+      <w:jc w:val="both"/>
+      <w:rPr>
+        <w:bCs/>
+        <w:sz w:val="28"/>
+        <w:szCs w:val="28"/>
+        <w:lang w:val="en-US"/>
+      </w:rPr>
+    </w:pPr>
+  </w:p>
+</w:ftr>
+</file>
+
+<file path=word/footnotes.xml><?xml version="1.0" encoding="utf-8"?>
+<w:footnotes xmlns:wpc="http://schemas.microsoft.com/office/word/2010/wordprocessingCanvas" xmlns:cx="http://schemas.microsoft.com/office/drawing/2014/chartex" xmlns:cx1="http://schemas.microsoft.com/office/drawing/2015/9/8/chartex" xmlns:cx2="http://schemas.microsoft.com/office/drawing/2015/10/21/chartex" xmlns:cx3="http://schemas.microsoft.com/office/drawing/2016/5/9/chartex" xmlns:cx4="http://schemas.microsoft.com/office/drawing/2016/5/10/chartex" xmlns:cx5="http://schemas.microsoft.com/office/drawing/2016/5/11/chartex" xmlns:cx6="http://schemas.microsoft.com/office/drawing/2016/5/12/chartex" xmlns:cx7="http://schemas.microsoft.com/office/drawing/2016/5/13/chartex" xmlns:cx8="http://schemas.microsoft.com/office/drawing/2016/5/14/chartex" xmlns:mc="http://schemas.openxmlformats.org/markup-compatibility/2006" xmlns:aink="http://schemas.microsoft.com/office/drawing/2016/ink" xmlns:am3d="http://schemas.microsoft.com/office/drawing/2017/model3d" xmlns:o="urn:schemas-microsoft-com:office:office" xmlns:oel="http://schemas.microsoft.com/office/2019/extlst" xmlns:r="http://schemas.openxmlformats.org/officeDocument/2006/relationships" xmlns:m="http://schemas.openxmlformats.org/officeDocument/2006/math" xmlns:v="urn:schemas-microsoft-com:vml" xmlns:wp14="http://schemas.microsoft.com/office/word/2010/wordprocessingDrawing" xmlns:wp="http://schemas.openxmlformats.org/drawingml/2006/wordprocessingDrawing" xmlns:w10="urn:schemas-microsoft-com:office:word" xmlns:w="http://schemas.openxmlformats.org/wordprocessingml/2006/main" xmlns:w14="http://schemas.microsoft.com/office/word/2010/wordml" xmlns:w15="http://schemas.microsoft.com/office/word/2012/wordml" xmlns:w16cex="http://schemas.microsoft.com/office/word/2018/wordml/cex" xmlns:w16cid="http://schemas.microsoft.com/office/word/2016/wordml/cid" xmlns:w16="http://schemas.microsoft.com/office/word/2018/wordml" xmlns:w16sdtdh="http://schemas.microsoft.com/office/word/2020/wordml/sdtdatahash" xmlns:w16se="http://schemas.microsoft.com/office/word/2015/wordml/symex" xmlns:wpg="http://schemas.microsoft.com/office/word/2010/wordprocessingGroup" xmlns:wpi="http://schemas.microsoft.com/office/word/2010/wordprocessingInk" xmlns:wne="http://schemas.microsoft.com/office/word/2006/wordml" xmlns:wps="http://schemas.microsoft.com/office/word/2010/wordprocessingShape" mc:Ignorable="w14 w15 w16se w16cid w16 w16cex w16sdtdh wp14">
+  <w:footnote w:type="separator" w:id="-1">
+    <w:p>
+      <w:r>
+        <w:separator/>
+      </w:r>
+    </w:p>
+  </w:footnote>
+  <w:footnote w:type="continuationSeparator" w:id="0">
+    <w:p>
+      <w:r>
+        <w:continuationSeparator/>
+      </w:r>
+    </w:p>
+  </w:footnote>
+</w:footnotes>
+</file>
+
 <file path=word/styles.xml><?xml version="1.0" encoding="utf-8"?>
-<w:styles xmlns:mc="http://schemas.openxmlformats.org/markup-compatibility/2006" xmlns:r="http://schemas.openxmlformats.org/officeDocument/2006/relationships" xmlns:w="http://schemas.openxmlformats.org/wordprocessingml/2006/main" xmlns:w14="http://schemas.microsoft.com/office/word/2010/wordml" xmlns:w15="http://schemas.microsoft.com/office/word/2012/wordml" xmlns:w16cex="http://schemas.microsoft.com/office/word/2018/wordml/cex" xmlns:w16cid="http://schemas.microsoft.com/office/word/2016/wordml/cid" xmlns:w16="http://schemas.microsoft.com/office/word/2018/wordml" xmlns:w16du="http://schemas.microsoft.com/office/word/2023/wordml/word16du" xmlns:w16sdtdh="http://schemas.microsoft.com/office/word/2020/wordml/sdtdatahash" xmlns:w16sdtfl="http://schemas.microsoft.com/office/word/2024/wordml/sdtformatlock" xmlns:w16se="http://schemas.microsoft.com/office/word/2015/wordml/symex" mc:Ignorable="w14 w15 w16se w16cid w16 w16cex w16sdtdh w16sdtfl w16du">
+<w:styles xmlns:mc="http://schemas.openxmlformats.org/markup-compatibility/2006" xmlns:r="http://schemas.openxmlformats.org/officeDocument/2006/relationships" xmlns:w="http://schemas.openxmlformats.org/wordprocessingml/2006/main" xmlns:w14="http://schemas.microsoft.com/office/word/2010/wordml" xmlns:w15="http://schemas.microsoft.com/office/word/2012/wordml" xmlns:w16cex="http://schemas.microsoft.com/office/word/2018/wordml/cex" xmlns:w16cid="http://schemas.microsoft.com/office/word/2016/wordml/cid" xmlns:w16="http://schemas.microsoft.com/office/word/2018/wordml" xmlns:w16sdtdh="http://schemas.microsoft.com/office/word/2020/wordml/sdtdatahash" xmlns:w16se="http://schemas.microsoft.com/office/word/2015/wordml/symex" mc:Ignorable="w14 w15 w16se w16cid w16 w16cex w16sdtdh">
   <w:docDefaults>
     <w:rPrDefault>
       <w:rPr>
@@ -3974,10 +3867,10 @@
     <w:lsdException w:name="Unresolved Mention" w:semiHidden="1" w:unhideWhenUsed="1"/>
     <w:lsdException w:name="Smart Link" w:semiHidden="1" w:unhideWhenUsed="1"/>
   </w:latentStyles>
-  <w:style w:type="paragraph" w:default="1" w:styleId="a">
+  <w:style w:type="paragraph" w:default="1" w:styleId="Normal">
     <w:name w:val="Normal"/>
     <w:qFormat/>
-    <w:rsid w:val="00B2620F"/>
+    <w:rsid w:val="00F64BBF"/>
     <w:pPr>
       <w:spacing w:after="0" w:line="240" w:lineRule="auto"/>
     </w:pPr>
@@ -3988,13 +3881,13 @@
       <w:lang w:eastAsia="ru-RU"/>
     </w:rPr>
   </w:style>
-  <w:style w:type="character" w:default="1" w:styleId="a0">
+  <w:style w:type="character" w:default="1" w:styleId="DefaultParagraphFont">
     <w:name w:val="Default Paragraph Font"/>
     <w:uiPriority w:val="1"/>
     <w:semiHidden/>
     <w:unhideWhenUsed/>
   </w:style>
-  <w:style w:type="table" w:default="1" w:styleId="a1">
+  <w:style w:type="table" w:default="1" w:styleId="TableNormal">
     <w:name w:val="Normal Table"/>
     <w:uiPriority w:val="99"/>
     <w:semiHidden/>
@@ -4009,7 +3902,7 @@
       </w:tblCellMar>
     </w:tblPr>
   </w:style>
-  <w:style w:type="numbering" w:default="1" w:styleId="a2">
+  <w:style w:type="numbering" w:default="1" w:styleId="NoList">
     <w:name w:val="No List"/>
     <w:uiPriority w:val="99"/>
     <w:semiHidden/>
@@ -4044,10 +3937,10 @@
       <w:sz w:val="20"/>
     </w:rPr>
   </w:style>
-  <w:style w:type="paragraph" w:styleId="a3">
+  <w:style w:type="paragraph" w:styleId="BalloonText">
     <w:name w:val="Balloon Text"/>
-    <w:basedOn w:val="a"/>
-    <w:link w:val="a4"/>
+    <w:basedOn w:val="Normal"/>
+    <w:link w:val="BalloonTextChar"/>
     <w:uiPriority w:val="99"/>
     <w:semiHidden/>
     <w:unhideWhenUsed/>
@@ -4058,10 +3951,10 @@
       <w:szCs w:val="16"/>
     </w:rPr>
   </w:style>
-  <w:style w:type="character" w:customStyle="1" w:styleId="a4">
-    <w:name w:val="Текст у виносці Знак"/>
-    <w:basedOn w:val="a0"/>
-    <w:link w:val="a3"/>
+  <w:style w:type="character" w:customStyle="1" w:styleId="BalloonTextChar">
+    <w:name w:val="Balloon Text Char"/>
+    <w:basedOn w:val="DefaultParagraphFont"/>
+    <w:link w:val="BalloonText"/>
     <w:uiPriority w:val="99"/>
     <w:semiHidden/>
     <w:rsid w:val="00AC4E4F"/>
@@ -4072,9 +3965,9 @@
       <w:lang w:eastAsia="ru-RU"/>
     </w:rPr>
   </w:style>
-  <w:style w:type="character" w:styleId="a5">
+  <w:style w:type="character" w:styleId="Emphasis">
     <w:name w:val="Emphasis"/>
-    <w:basedOn w:val="a0"/>
+    <w:basedOn w:val="DefaultParagraphFont"/>
     <w:uiPriority w:val="20"/>
     <w:qFormat/>
     <w:rsid w:val="00796DF0"/>
@@ -4083,9 +3976,9 @@
       <w:iCs/>
     </w:rPr>
   </w:style>
-  <w:style w:type="table" w:styleId="a6">
+  <w:style w:type="table" w:styleId="TableGrid">
     <w:name w:val="Table Grid"/>
-    <w:basedOn w:val="a1"/>
+    <w:basedOn w:val="TableNormal"/>
     <w:uiPriority w:val="39"/>
     <w:rsid w:val="00580E80"/>
     <w:pPr>
@@ -4104,6 +3997,60 @@
         <w:insideV w:val="single" w:sz="4" w:space="0" w:color="auto"/>
       </w:tblBorders>
     </w:tblPr>
+  </w:style>
+  <w:style w:type="paragraph" w:styleId="Header">
+    <w:name w:val="header"/>
+    <w:basedOn w:val="Normal"/>
+    <w:link w:val="HeaderChar"/>
+    <w:uiPriority w:val="99"/>
+    <w:unhideWhenUsed/>
+    <w:rsid w:val="0037598C"/>
+    <w:pPr>
+      <w:tabs>
+        <w:tab w:val="center" w:pos="4513"/>
+        <w:tab w:val="right" w:pos="9026"/>
+      </w:tabs>
+    </w:pPr>
+  </w:style>
+  <w:style w:type="character" w:customStyle="1" w:styleId="HeaderChar">
+    <w:name w:val="Header Char"/>
+    <w:basedOn w:val="DefaultParagraphFont"/>
+    <w:link w:val="Header"/>
+    <w:uiPriority w:val="99"/>
+    <w:rsid w:val="0037598C"/>
+    <w:rPr>
+      <w:rFonts w:ascii="Times New Roman" w:eastAsia="Times New Roman" w:hAnsi="Times New Roman" w:cs="Times New Roman"/>
+      <w:sz w:val="24"/>
+      <w:szCs w:val="24"/>
+      <w:lang w:eastAsia="ru-RU"/>
+    </w:rPr>
+  </w:style>
+  <w:style w:type="paragraph" w:styleId="Footer">
+    <w:name w:val="footer"/>
+    <w:basedOn w:val="Normal"/>
+    <w:link w:val="FooterChar"/>
+    <w:uiPriority w:val="99"/>
+    <w:unhideWhenUsed/>
+    <w:rsid w:val="0037598C"/>
+    <w:pPr>
+      <w:tabs>
+        <w:tab w:val="center" w:pos="4513"/>
+        <w:tab w:val="right" w:pos="9026"/>
+      </w:tabs>
+    </w:pPr>
+  </w:style>
+  <w:style w:type="character" w:customStyle="1" w:styleId="FooterChar">
+    <w:name w:val="Footer Char"/>
+    <w:basedOn w:val="DefaultParagraphFont"/>
+    <w:link w:val="Footer"/>
+    <w:uiPriority w:val="99"/>
+    <w:rsid w:val="0037598C"/>
+    <w:rPr>
+      <w:rFonts w:ascii="Times New Roman" w:eastAsia="Times New Roman" w:hAnsi="Times New Roman" w:cs="Times New Roman"/>
+      <w:sz w:val="24"/>
+      <w:szCs w:val="24"/>
+      <w:lang w:eastAsia="ru-RU"/>
+    </w:rPr>
   </w:style>
 </w:styles>
 </file>

</xml_diff>